<commit_message>
What a day of typing into it taught the suite
Recreating three real documents by hand, menus and keystrokes only,
found what no test suite had: Scriva could not insert a table or offer
a style to a new document, formatting a blank line did nothing, an en
dash could bring the whole application down, and a cell merge or a
freshly made table quietly missed the save. All fixed: a table emitter
and block-level undo, seeded quick styles that reach styles.xml,
formatting held on the paragraph mark, boundary-safe word probing, a
mergeCells writer, double-click renames a sheet tab, 10.5pt in the
size list, and the menu asks about unsaved changes like Ctrl+N always
did. The corpus strangers now carry the stylesheet a second producer
really ships.

Co-Authored-By: Claude Fable 5 <noreply@anthropic.com>
</commit_message>
<xml_diff>
--- a/corpus/docx/file-sample_100kB.docx
+++ b/corpus/docx/file-sample_100kB.docx
@@ -107,5 +107,85 @@
     </w:rPrDefault>
     <w:pPrDefault/>
   </w:docDefaults>
+  <w:style w:type="paragraph" w:default="1" w:styleId="Normal">
+    <w:name w:val="Normal"/>
+  </w:style>
+  <w:style w:type="paragraph" w:styleId="Heading">
+    <w:name w:val="Heading"/>
+    <w:basedOn w:val="Normal"/>
+    <w:rPr>
+      <w:sz w:val="28"/>
+      <w:szCs w:val="28"/>
+    </w:rPr>
+  </w:style>
+  <w:style w:type="paragraph" w:styleId="Heading1">
+    <w:name w:val="Heading 1"/>
+    <w:basedOn w:val="Heading"/>
+    <w:rPr>
+      <w:b/>
+      <w:sz w:val="36"/>
+      <w:szCs w:val="36"/>
+    </w:rPr>
+  </w:style>
+  <w:style w:type="paragraph" w:styleId="Heading2">
+    <w:name w:val="Heading 2"/>
+    <w:basedOn w:val="Heading"/>
+    <w:rPr>
+      <w:b/>
+      <w:sz w:val="32"/>
+      <w:szCs w:val="32"/>
+    </w:rPr>
+  </w:style>
+  <w:style w:type="paragraph" w:styleId="Heading3">
+    <w:name w:val="Heading 3"/>
+    <w:basedOn w:val="Heading"/>
+    <w:rPr>
+      <w:b/>
+      <w:sz w:val="28"/>
+      <w:szCs w:val="28"/>
+    </w:rPr>
+  </w:style>
+  <w:style w:type="paragraph" w:styleId="Title">
+    <w:name w:val="Title"/>
+    <w:basedOn w:val="Heading"/>
+    <w:rPr>
+      <w:b/>
+      <w:sz w:val="56"/>
+      <w:szCs w:val="56"/>
+    </w:rPr>
+  </w:style>
+  <w:style w:type="paragraph" w:styleId="Subtitle">
+    <w:name w:val="Subtitle"/>
+    <w:basedOn w:val="Heading"/>
+    <w:rPr>
+      <w:sz w:val="36"/>
+      <w:szCs w:val="36"/>
+    </w:rPr>
+  </w:style>
+  <w:style w:type="paragraph" w:styleId="TextBody">
+    <w:name w:val="Text Body"/>
+    <w:basedOn w:val="Normal"/>
+  </w:style>
+  <w:style w:type="paragraph" w:styleId="List">
+    <w:name w:val="List"/>
+    <w:basedOn w:val="TextBody"/>
+  </w:style>
+  <w:style w:type="paragraph" w:styleId="Caption">
+    <w:name w:val="Caption"/>
+    <w:basedOn w:val="Normal"/>
+    <w:rPr>
+      <w:i/>
+      <w:sz w:val="24"/>
+      <w:szCs w:val="24"/>
+    </w:rPr>
+  </w:style>
+  <w:style w:type="paragraph" w:styleId="Index">
+    <w:name w:val="Index"/>
+    <w:basedOn w:val="Normal"/>
+  </w:style>
+  <w:style w:type="paragraph" w:styleId="TableContents">
+    <w:name w:val="Table Contents"/>
+    <w:basedOn w:val="Normal"/>
+  </w:style>
 </w:styles>
 </file>
</xml_diff>